<commit_message>
Clarify target-ion parameter optimization
</commit_message>
<xml_diff>
--- a/docs/RATIO_DIA_Method_and_Parameter_Information_for_SI.docx
+++ b/docs/RATIO_DIA_Method_and_Parameter_Information_for_SI.docx
@@ -172,7 +172,7 @@
         <w:pStyle w:val="Heading1"/>
       </w:pPr>
       <w:r>
-        <w:t>S4. Multiresolution module partition and parameter calibration</w:t>
+        <w:t>S4. Multiresolution module partition and parameter optimization</w:t>
       </w:r>
     </w:p>
     <w:p>
@@ -180,7 +180,7 @@
         <w:pStyle w:val="BodyText"/>
       </w:pPr>
       <w:r>
-        <w:t>The evidence-weighted graph was partitioned using weighted Louvain community detection. A fixed grid of 1,008 candidate settings was evaluated. Module-size constraints were applied during candidate-partition selection rather than within Louvain optimization. Candidate settings were excluded when either the largest module or the representative-feature module contained more than 100 nodes.</w:t>
+        <w:t>The evidence-weighted graph was partitioned using weighted Louvain community detection. A fixed grid of 1,008 candidate settings was evaluated. Module-size constraints were applied during candidate-partition selection rather than within Louvain optimization. Candidate settings were excluded when either the largest module or the module containing the target feature ions exceeded 100 nodes.</w:t>
       </w:r>
     </w:p>
     <w:p>
@@ -188,7 +188,7 @@
         <w:pStyle w:val="BodyText"/>
       </w:pPr>
       <w:r>
-        <w:t>Twelve representative dimer-related features were used solely for parameter calibration. Eligible partitions were ranked lexicographically by: (1) the number of representative features recovered in one module; (2) the size of that target module, favoring compactness; (3) representative-pair co-clustering; (4) the number of nodes assigned to modules containing more than 10 nodes; and (5) weighted modularity. The representative set was therefore not an independent validation set. Candidate structures, fraction abundances, and biological activity labels were not used during network construction or module selection.</w:t>
+        <w:t>Before structural identification, a predefined group of target feature ions, including precursor ions at m/z 571.2803, 518.2184, and 559.2807 together with related feature ions, was used to optimize network partitioning. Eligible partitions were ranked lexicographically by: (1) the number of target feature ions co-clustered in one module; (2) the size of that module, favoring compactness; (3) the proportion of target-ion pairs assigned to the same module; (4) the number of nodes assigned to modules containing more than 10 nodes; and (5) weighted modularity. These feature ions defined the parameter-optimization objective; their structural identities and bioactivities were not used to construct graph edges or determine module boundaries.</w:t>
       </w:r>
     </w:p>
     <w:p>
@@ -892,7 +892,7 @@
         <w:pStyle w:val="BodyText"/>
       </w:pPr>
       <w:r>
-        <w:t>The selected setting generated 20,937 evidence-weighted relationships and 21 modules containing at least three nodes. All 878 connected input nodes were assigned. Eighteen modules contained more than 10 nodes and collectively included 855 nodes. The largest module contained 96 nodes, and 11 of the 12 representative features were recovered in M1.</w:t>
+        <w:t>The selected setting generated 20,937 evidence-weighted relationships and 21 modules containing at least three nodes. All 878 connected input nodes were assigned. Eighteen modules contained more than 10 nodes and collectively included 855 nodes. The largest module contained 96 nodes, and 11 of the 12 target feature ions were co-clustered in M1.</w:t>
       </w:r>
     </w:p>
     <w:tbl>
@@ -1342,7 +1342,7 @@
               <w:rPr>
                 <w:sz w:val="16"/>
               </w:rPr>
-              <w:t>Representative features recovered in M1</w:t>
+              <w:t>Target feature ions co-clustered in M1</w:t>
             </w:r>
           </w:p>
         </w:tc>
@@ -1799,7 +1799,7 @@
               <w:rPr>
                 <w:sz w:val="16"/>
               </w:rPr>
-              <w:t>All 1,008 candidates when calibration is enabled</w:t>
+              <w:t>All 1,008 candidates when parameter optimization is enabled</w:t>
             </w:r>
           </w:p>
         </w:tc>
@@ -1855,7 +1855,7 @@
         <w:pStyle w:val="BodyText"/>
       </w:pPr>
       <w:r>
-        <w:t>To repeat calibration rather than applying the selected setting directly, add --parameter-search --representative-nodes representative_nodes.txt. The representative-node file should contain one Alignment ID per line.</w:t>
+        <w:t>To repeat parameter optimization rather than applying the selected setting directly, add --parameter-search --target-feature-nodes target_feature_nodes.txt. The target-feature file should contain one Alignment ID per line.</w:t>
       </w:r>
     </w:p>
     <w:p>

</xml_diff>